<commit_message>
add calibration targets and some descriptions
</commit_message>
<xml_diff>
--- a/applications/SHIELD/Documentation/Supplement/shield_supplement.docx
+++ b/applications/SHIELD/Documentation/Supplement/shield_supplement.docx
@@ -1,6 +1,6 @@
 
 <file path=word/document.xml><?xml version="1.0" encoding="utf-8"?>
-<w:document xmlns:wpc="http://schemas.microsoft.com/office/word/2010/wordprocessingCanvas" xmlns:cx="http://schemas.microsoft.com/office/drawing/2014/chartex" xmlns:cx1="http://schemas.microsoft.com/office/drawing/2015/9/8/chartex" xmlns:cx2="http://schemas.microsoft.com/office/drawing/2015/10/21/chartex" xmlns:cx3="http://schemas.microsoft.com/office/drawing/2016/5/9/chartex" xmlns:cx4="http://schemas.microsoft.com/office/drawing/2016/5/10/chartex" xmlns:cx5="http://schemas.microsoft.com/office/drawing/2016/5/11/chartex" xmlns:cx6="http://schemas.microsoft.com/office/drawing/2016/5/12/chartex" xmlns:cx7="http://schemas.microsoft.com/office/drawing/2016/5/13/chartex" xmlns:cx8="http://schemas.microsoft.com/office/drawing/2016/5/14/chartex" xmlns:mc="http://schemas.openxmlformats.org/markup-compatibility/2006" xmlns:m="http://schemas.openxmlformats.org/officeDocument/2006/math" xmlns:aink="http://schemas.microsoft.com/office/drawing/2016/ink" xmlns:am3d="http://schemas.microsoft.com/office/drawing/2017/model3d" xmlns:oel="http://schemas.microsoft.com/office/2019/extlst" xmlns:r="http://schemas.openxmlformats.org/officeDocument/2006/relationships" xmlns:wp14="http://schemas.microsoft.com/office/word/2010/wordprocessingDrawing" xmlns:wp="http://schemas.openxmlformats.org/drawingml/2006/wordprocessingDrawing" xmlns:wpg="http://schemas.microsoft.com/office/word/2010/wordprocessingGroup" xmlns:wpi="http://schemas.microsoft.com/office/word/2010/wordprocessingInk" xmlns:wps="http://schemas.microsoft.com/office/word/2010/wordprocessingShape" xmlns:o="urn:schemas-microsoft-com:office:office" xmlns:v="urn:schemas-microsoft-com:vml" xmlns:w10="urn:schemas-microsoft-com:office:word" xmlns:w="http://schemas.openxmlformats.org/wordprocessingml/2006/main" xmlns:w14="http://schemas.microsoft.com/office/word/2010/wordml" xmlns:w15="http://schemas.microsoft.com/office/word/2012/wordml" xmlns:w16cei="http://schemas.microsoft.com/office/word/2026/wordml/cei" xmlns:w16cex="http://schemas.microsoft.com/office/word/2018/wordml/cex" xmlns:w16cid="http://schemas.microsoft.com/office/word/2016/wordml/cid" xmlns:w16="http://schemas.microsoft.com/office/word/2018/wordml" xmlns:w16sdtdh="http://schemas.microsoft.com/office/word/2020/wordml/sdtdatahash" xmlns:w16sdtfl="http://schemas.microsoft.com/office/word/2024/wordml/sdtformatlock" xmlns:w16se="http://schemas.microsoft.com/office/word/2015/wordml/symex" xmlns:w16du="http://schemas.microsoft.com/office/word/2023/wordml/word16du" xmlns:wne="http://schemas.microsoft.com/office/word/2006/wordml" mc:Ignorable="w14 w15 w16se w16cid w16 w16cex w16sdtdh w16sdtfl w16du wp14">
+<w:document xmlns:wpc="http://schemas.microsoft.com/office/word/2010/wordprocessingCanvas" xmlns:cx="http://schemas.microsoft.com/office/drawing/2014/chartex" xmlns:cx1="http://schemas.microsoft.com/office/drawing/2015/9/8/chartex" xmlns:cx2="http://schemas.microsoft.com/office/drawing/2015/10/21/chartex" xmlns:cx3="http://schemas.microsoft.com/office/drawing/2016/5/9/chartex" xmlns:cx4="http://schemas.microsoft.com/office/drawing/2016/5/10/chartex" xmlns:cx5="http://schemas.microsoft.com/office/drawing/2016/5/11/chartex" xmlns:cx6="http://schemas.microsoft.com/office/drawing/2016/5/12/chartex" xmlns:cx7="http://schemas.microsoft.com/office/drawing/2016/5/13/chartex" xmlns:cx8="http://schemas.microsoft.com/office/drawing/2016/5/14/chartex" xmlns:mc="http://schemas.openxmlformats.org/markup-compatibility/2006" xmlns:aink="http://schemas.microsoft.com/office/drawing/2016/ink" xmlns:am3d="http://schemas.microsoft.com/office/drawing/2017/model3d" xmlns:o="urn:schemas-microsoft-com:office:office" xmlns:oel="http://schemas.microsoft.com/office/2019/extlst" xmlns:r="http://schemas.openxmlformats.org/officeDocument/2006/relationships" xmlns:m="http://schemas.openxmlformats.org/officeDocument/2006/math" xmlns:v="urn:schemas-microsoft-com:vml" xmlns:wp14="http://schemas.microsoft.com/office/word/2010/wordprocessingDrawing" xmlns:wp="http://schemas.openxmlformats.org/drawingml/2006/wordprocessingDrawing" xmlns:w10="urn:schemas-microsoft-com:office:word" xmlns:w="http://schemas.openxmlformats.org/wordprocessingml/2006/main" xmlns:w14="http://schemas.microsoft.com/office/word/2010/wordml" xmlns:w15="http://schemas.microsoft.com/office/word/2012/wordml" xmlns:w16cei="http://schemas.microsoft.com/office/word/2026/wordml/cei" xmlns:w16cex="http://schemas.microsoft.com/office/word/2018/wordml/cex" xmlns:w16cid="http://schemas.microsoft.com/office/word/2016/wordml/cid" xmlns:w16="http://schemas.microsoft.com/office/word/2018/wordml" xmlns:w16du="http://schemas.microsoft.com/office/word/2023/wordml/word16du" xmlns:w16sdtdh="http://schemas.microsoft.com/office/word/2020/wordml/sdtdatahash" xmlns:w16sdtfl="http://schemas.microsoft.com/office/word/2024/wordml/sdtformatlock" xmlns:w16se="http://schemas.microsoft.com/office/word/2015/wordml/symex" xmlns:wpg="http://schemas.microsoft.com/office/word/2010/wordprocessingGroup" xmlns:wpi="http://schemas.microsoft.com/office/word/2010/wordprocessingInk" xmlns:wne="http://schemas.microsoft.com/office/word/2006/wordml" xmlns:wps="http://schemas.microsoft.com/office/word/2010/wordprocessingShape" mc:Ignorable="w14 w15 w16se w16cid w16 w16cex w16sdtdh w16sdtfl w16du wp14">
   <w:body>
     <w:p>
       <w:pPr>
@@ -4151,17 +4151,6 @@
         <w:t>Calibration targets</w:t>
       </w:r>
     </w:p>
-    <w:p>
-      <w:r>
-        <w:t>List of all calibration targets</w:t>
-      </w:r>
-    </w:p>
-    <w:p/>
-    <w:p>
-      <w:r>
-        <w:t>@Andrew, we will likely need to include a subsection on some of these calibration targets to describe how the likelihood function was constructed. for example, proportion of male diagnosis among MSM or future growth penalty</w:t>
-      </w:r>
-    </w:p>
     <w:tbl>
       <w:tblPr>
         <w:tblStyle w:val="TableGrid"/>
@@ -4169,15 +4158,15 @@
         <w:tblLook w:val="04A0" w:firstRow="1" w:lastRow="0" w:firstColumn="1" w:lastColumn="0" w:noHBand="0" w:noVBand="1"/>
       </w:tblPr>
       <w:tblGrid>
-        <w:gridCol w:w="2801"/>
-        <w:gridCol w:w="2446"/>
-        <w:gridCol w:w="2861"/>
-        <w:gridCol w:w="2682"/>
+        <w:gridCol w:w="2768"/>
+        <w:gridCol w:w="2409"/>
+        <w:gridCol w:w="2841"/>
+        <w:gridCol w:w="2772"/>
       </w:tblGrid>
       <w:tr>
         <w:tc>
           <w:tcPr>
-            <w:tcW w:w="2801" w:type="dxa"/>
+            <w:tcW w:w="2768" w:type="dxa"/>
           </w:tcPr>
           <w:p>
             <w:r>
@@ -4187,7 +4176,7 @@
         </w:tc>
         <w:tc>
           <w:tcPr>
-            <w:tcW w:w="2446" w:type="dxa"/>
+            <w:tcW w:w="2409" w:type="dxa"/>
           </w:tcPr>
           <w:p>
             <w:r>
@@ -4197,7 +4186,7 @@
         </w:tc>
         <w:tc>
           <w:tcPr>
-            <w:tcW w:w="2861" w:type="dxa"/>
+            <w:tcW w:w="2841" w:type="dxa"/>
           </w:tcPr>
           <w:p>
             <w:r>
@@ -4207,7 +4196,7 @@
         </w:tc>
         <w:tc>
           <w:tcPr>
-            <w:tcW w:w="2682" w:type="dxa"/>
+            <w:tcW w:w="2772" w:type="dxa"/>
           </w:tcPr>
           <w:p>
             <w:r>
@@ -4219,30 +4208,47 @@
       <w:tr>
         <w:tc>
           <w:tcPr>
-            <w:tcW w:w="2801" w:type="dxa"/>
-          </w:tcPr>
-          <w:p/>
-        </w:tc>
-        <w:tc>
-          <w:tcPr>
-            <w:tcW w:w="2446" w:type="dxa"/>
-          </w:tcPr>
-          <w:p/>
-        </w:tc>
-        <w:tc>
-          <w:tcPr>
-            <w:tcW w:w="2861" w:type="dxa"/>
-          </w:tcPr>
-          <w:p>
-            <w:r>
-              <w:t># years, stratification level/ Stage</w:t>
-            </w:r>
-          </w:p>
-          <w:p/>
-        </w:tc>
-        <w:tc>
-          <w:tcPr>
-            <w:tcW w:w="2682" w:type="dxa"/>
+            <w:tcW w:w="2768" w:type="dxa"/>
+          </w:tcPr>
+          <w:p>
+            <w:r>
+              <w:t>Primary &amp; Secondary syphilis diagnosis count</w:t>
+            </w:r>
+          </w:p>
+        </w:tc>
+        <w:tc>
+          <w:tcPr>
+            <w:tcW w:w="2409" w:type="dxa"/>
+          </w:tcPr>
+          <w:p>
+            <w:r>
+              <w:t>2010 to 2022</w:t>
+            </w:r>
+          </w:p>
+        </w:tc>
+        <w:tc>
+          <w:tcPr>
+            <w:tcW w:w="2841" w:type="dxa"/>
+          </w:tcPr>
+          <w:p>
+            <w:r>
+              <w:t>Total (stage1)</w:t>
+            </w:r>
+          </w:p>
+          <w:p>
+            <w:r>
+              <w:t>Total and one-way by sex, race, and age (stage2)</w:t>
+            </w:r>
+          </w:p>
+          <w:p>
+            <w:r>
+              <w:t xml:space="preserve">Total, one-way and two-way by sex, race, and age (stage3) </w:t>
+            </w:r>
+          </w:p>
+        </w:tc>
+        <w:tc>
+          <w:tcPr>
+            <w:tcW w:w="2772" w:type="dxa"/>
           </w:tcPr>
           <w:p/>
         </w:tc>
@@ -4250,177 +4256,550 @@
       <w:tr>
         <w:tc>
           <w:tcPr>
-            <w:tcW w:w="2801" w:type="dxa"/>
-          </w:tcPr>
-          <w:p>
-            <w:r>
-              <w:t>Primary &amp; Secondary syphilis diagnosis count</w:t>
-            </w:r>
-          </w:p>
-        </w:tc>
-        <w:tc>
-          <w:tcPr>
-            <w:tcW w:w="2446" w:type="dxa"/>
-          </w:tcPr>
-          <w:p>
-            <w:r>
-              <w:t>2010 to 2022</w:t>
-            </w:r>
-          </w:p>
-        </w:tc>
-        <w:tc>
-          <w:tcPr>
-            <w:tcW w:w="2861" w:type="dxa"/>
-          </w:tcPr>
-          <w:p>
-            <w:r>
-              <w:t>Total (stage1)</w:t>
-            </w:r>
-          </w:p>
-          <w:p>
-            <w:r>
-              <w:t>Total and one-way by sex, race, and age (stage2)</w:t>
-            </w:r>
-          </w:p>
-          <w:p>
-            <w:r>
-              <w:t xml:space="preserve">Total, one-way and two-way by sex, race, and age (stage3) </w:t>
-            </w:r>
-          </w:p>
-        </w:tc>
-        <w:tc>
-          <w:tcPr>
-            <w:tcW w:w="2682" w:type="dxa"/>
-          </w:tcPr>
-          <w:p/>
+            <w:tcW w:w="2768" w:type="dxa"/>
+          </w:tcPr>
+          <w:p>
+            <w:r>
+              <w:t>Population</w:t>
+            </w:r>
+          </w:p>
+        </w:tc>
+        <w:tc>
+          <w:tcPr>
+            <w:tcW w:w="2409" w:type="dxa"/>
+          </w:tcPr>
+          <w:p>
+            <w:r>
+              <w:t>2010 to 2023</w:t>
+            </w:r>
+          </w:p>
+        </w:tc>
+        <w:tc>
+          <w:tcPr>
+            <w:tcW w:w="2841" w:type="dxa"/>
+          </w:tcPr>
+          <w:p>
+            <w:r>
+              <w:t>Total, one-way and two-way by age, race, and sex (stages 1, 3, and 4)</w:t>
+            </w:r>
+          </w:p>
+        </w:tc>
+        <w:tc>
+          <w:tcPr>
+            <w:tcW w:w="2772" w:type="dxa"/>
+          </w:tcPr>
+          <w:p>
+            <w:r>
+              <w:t>Census</w:t>
+            </w:r>
+          </w:p>
         </w:tc>
       </w:tr>
       <w:tr>
         <w:tc>
           <w:tcPr>
-            <w:tcW w:w="2801" w:type="dxa"/>
-          </w:tcPr>
-          <w:p/>
-        </w:tc>
-        <w:tc>
-          <w:tcPr>
-            <w:tcW w:w="2446" w:type="dxa"/>
-          </w:tcPr>
-          <w:p/>
-        </w:tc>
-        <w:tc>
-          <w:tcPr>
-            <w:tcW w:w="2861" w:type="dxa"/>
-          </w:tcPr>
-          <w:p/>
-        </w:tc>
-        <w:tc>
-          <w:tcPr>
-            <w:tcW w:w="2682" w:type="dxa"/>
-          </w:tcPr>
-          <w:p/>
+            <w:tcW w:w="2768" w:type="dxa"/>
+          </w:tcPr>
+          <w:p>
+            <w:r>
+              <w:t>Deaths</w:t>
+            </w:r>
+          </w:p>
+        </w:tc>
+        <w:tc>
+          <w:tcPr>
+            <w:tcW w:w="2409" w:type="dxa"/>
+          </w:tcPr>
+          <w:p>
+            <w:r>
+              <w:t>2010 to 2023</w:t>
+            </w:r>
+          </w:p>
+        </w:tc>
+        <w:tc>
+          <w:tcPr>
+            <w:tcW w:w="2841" w:type="dxa"/>
+          </w:tcPr>
+          <w:p>
+            <w:r>
+              <w:t>Total, one-way and two-way by age, race, and sex (stages 1, 3, and 4)</w:t>
+            </w:r>
+          </w:p>
+        </w:tc>
+        <w:tc>
+          <w:tcPr>
+            <w:tcW w:w="2772" w:type="dxa"/>
+          </w:tcPr>
+          <w:p>
+            <w:r>
+              <w:t>Census and CDC Wonder</w:t>
+            </w:r>
+          </w:p>
         </w:tc>
       </w:tr>
       <w:tr>
         <w:tc>
           <w:tcPr>
-            <w:tcW w:w="2801" w:type="dxa"/>
-          </w:tcPr>
-          <w:p/>
-        </w:tc>
-        <w:tc>
-          <w:tcPr>
-            <w:tcW w:w="2446" w:type="dxa"/>
-          </w:tcPr>
-          <w:p/>
-        </w:tc>
-        <w:tc>
-          <w:tcPr>
-            <w:tcW w:w="2861" w:type="dxa"/>
-          </w:tcPr>
-          <w:p/>
-        </w:tc>
-        <w:tc>
-          <w:tcPr>
-            <w:tcW w:w="2682" w:type="dxa"/>
-          </w:tcPr>
-          <w:p/>
+            <w:tcW w:w="2768" w:type="dxa"/>
+          </w:tcPr>
+          <w:p>
+            <w:r>
+              <w:t>Fertility Rate</w:t>
+            </w:r>
+          </w:p>
+        </w:tc>
+        <w:tc>
+          <w:tcPr>
+            <w:tcW w:w="2409" w:type="dxa"/>
+          </w:tcPr>
+          <w:p>
+            <w:r>
+              <w:t>2007 to 2023</w:t>
+            </w:r>
+          </w:p>
+        </w:tc>
+        <w:tc>
+          <w:tcPr>
+            <w:tcW w:w="2841" w:type="dxa"/>
+          </w:tcPr>
+          <w:p>
+            <w:r>
+              <w:t>Two-way by age and race (stages 1, 3, and 4)</w:t>
+            </w:r>
+          </w:p>
+        </w:tc>
+        <w:tc>
+          <w:tcPr>
+            <w:tcW w:w="2772" w:type="dxa"/>
+          </w:tcPr>
+          <w:p>
+            <w:r>
+              <w:t>CDC Wonder</w:t>
+            </w:r>
+          </w:p>
         </w:tc>
       </w:tr>
       <w:tr>
         <w:tc>
           <w:tcPr>
-            <w:tcW w:w="2801" w:type="dxa"/>
-          </w:tcPr>
-          <w:p/>
-        </w:tc>
-        <w:tc>
-          <w:tcPr>
-            <w:tcW w:w="2446" w:type="dxa"/>
-          </w:tcPr>
-          <w:p/>
-        </w:tc>
-        <w:tc>
-          <w:tcPr>
-            <w:tcW w:w="2861" w:type="dxa"/>
-          </w:tcPr>
-          <w:p/>
-        </w:tc>
-        <w:tc>
-          <w:tcPr>
-            <w:tcW w:w="2682" w:type="dxa"/>
-          </w:tcPr>
-          <w:p/>
+            <w:tcW w:w="2768" w:type="dxa"/>
+          </w:tcPr>
+          <w:p>
+            <w:r>
+              <w:t>Immigration and Emigration</w:t>
+            </w:r>
+          </w:p>
+        </w:tc>
+        <w:tc>
+          <w:tcPr>
+            <w:tcW w:w="2409" w:type="dxa"/>
+          </w:tcPr>
+          <w:p>
+            <w:r>
+              <w:t>2011 to 2020 (total)</w:t>
+            </w:r>
+          </w:p>
+          <w:p>
+            <w:r>
+              <w:t>2011 to 2015 (one-way)</w:t>
+            </w:r>
+          </w:p>
+        </w:tc>
+        <w:tc>
+          <w:tcPr>
+            <w:tcW w:w="2841" w:type="dxa"/>
+          </w:tcPr>
+          <w:p>
+            <w:r>
+              <w:t>Total and one-way by age, race, and sex (stages 1, 3, and 4)</w:t>
+            </w:r>
+          </w:p>
+        </w:tc>
+        <w:tc>
+          <w:tcPr>
+            <w:tcW w:w="2772" w:type="dxa"/>
+          </w:tcPr>
+          <w:p>
+            <w:r>
+              <w:t>Census</w:t>
+            </w:r>
+          </w:p>
         </w:tc>
       </w:tr>
       <w:tr>
         <w:tc>
           <w:tcPr>
-            <w:tcW w:w="2801" w:type="dxa"/>
-          </w:tcPr>
-          <w:p/>
-        </w:tc>
-        <w:tc>
-          <w:tcPr>
-            <w:tcW w:w="2446" w:type="dxa"/>
-          </w:tcPr>
-          <w:p/>
-        </w:tc>
-        <w:tc>
-          <w:tcPr>
-            <w:tcW w:w="2861" w:type="dxa"/>
-          </w:tcPr>
-          <w:p/>
-        </w:tc>
-        <w:tc>
-          <w:tcPr>
-            <w:tcW w:w="2682" w:type="dxa"/>
-          </w:tcPr>
-          <w:p/>
+            <w:tcW w:w="2768" w:type="dxa"/>
+          </w:tcPr>
+          <w:p>
+            <w:r>
+              <w:t>Total syphilis diagnosis count</w:t>
+            </w:r>
+          </w:p>
+        </w:tc>
+        <w:tc>
+          <w:tcPr>
+            <w:tcW w:w="2409" w:type="dxa"/>
+          </w:tcPr>
+          <w:p>
+            <w:r>
+              <w:t>1993 to 2021 (total)</w:t>
+            </w:r>
+          </w:p>
+          <w:p>
+            <w:r>
+              <w:lastRenderedPageBreak/>
+              <w:t>2019 to 2021 (one-way and two-way)</w:t>
+            </w:r>
+          </w:p>
+        </w:tc>
+        <w:tc>
+          <w:tcPr>
+            <w:tcW w:w="2841" w:type="dxa"/>
+          </w:tcPr>
+          <w:p>
+            <w:r>
+              <w:lastRenderedPageBreak/>
+              <w:t>Total and one-way (stage 2) by age, race, and sex</w:t>
+            </w:r>
+          </w:p>
+          <w:p>
+            <w:r>
+              <w:lastRenderedPageBreak/>
+              <w:t>Total, one-way, and two-way by age, race, and sex (stages 3 and 4)</w:t>
+            </w:r>
+          </w:p>
+        </w:tc>
+        <w:tc>
+          <w:tcPr>
+            <w:tcW w:w="2772" w:type="dxa"/>
+          </w:tcPr>
+          <w:p>
+            <w:r>
+              <w:lastRenderedPageBreak/>
+              <w:t xml:space="preserve">CDC (cdc.aggregated.county?), </w:t>
+            </w:r>
+            <w:r>
+              <w:lastRenderedPageBreak/>
+              <w:t>CDC STI Surveillance Reports, local health department data</w:t>
+            </w:r>
+          </w:p>
         </w:tc>
       </w:tr>
       <w:tr>
         <w:tc>
           <w:tcPr>
-            <w:tcW w:w="2801" w:type="dxa"/>
+            <w:tcW w:w="2768" w:type="dxa"/>
+          </w:tcPr>
+          <w:p>
+            <w:r>
+              <w:lastRenderedPageBreak/>
+              <w:t>Historical total syphilis diagnosis count</w:t>
+            </w:r>
+          </w:p>
+        </w:tc>
+        <w:tc>
+          <w:tcPr>
+            <w:tcW w:w="2409" w:type="dxa"/>
+          </w:tcPr>
+          <w:p>
+            <w:r>
+              <w:t>1970 to 1989</w:t>
+            </w:r>
+          </w:p>
+        </w:tc>
+        <w:tc>
+          <w:tcPr>
+            <w:tcW w:w="2841" w:type="dxa"/>
+          </w:tcPr>
+          <w:p>
+            <w:r>
+              <w:t>Total (stages 2, 3, and 4)</w:t>
+            </w:r>
+          </w:p>
+        </w:tc>
+        <w:tc>
+          <w:tcPr>
+            <w:tcW w:w="2772" w:type="dxa"/>
+          </w:tcPr>
+          <w:p>
+            <w:r>
+              <w:t>CDC?</w:t>
+            </w:r>
+          </w:p>
+        </w:tc>
+      </w:tr>
+      <w:tr>
+        <w:tc>
+          <w:tcPr>
+            <w:tcW w:w="2768" w:type="dxa"/>
+          </w:tcPr>
+          <w:p>
+            <w:r>
+              <w:t>Primary &amp; Secondary syphilis diagnosis count</w:t>
+            </w:r>
+          </w:p>
+        </w:tc>
+        <w:tc>
+          <w:tcPr>
+            <w:tcW w:w="2409" w:type="dxa"/>
+          </w:tcPr>
+          <w:p>
+            <w:r>
+              <w:t>1993 to 2021 (total)</w:t>
+            </w:r>
+          </w:p>
+          <w:p>
+            <w:r>
+              <w:t>2019 to 2021 (one-way and two-way)</w:t>
+            </w:r>
+          </w:p>
+        </w:tc>
+        <w:tc>
+          <w:tcPr>
+            <w:tcW w:w="2841" w:type="dxa"/>
+          </w:tcPr>
+          <w:p>
+            <w:r>
+              <w:t>Total (stage 1)</w:t>
+            </w:r>
+          </w:p>
+          <w:p>
+            <w:r>
+              <w:t>Total and one-way (stage 2) by age, race, and sex</w:t>
+            </w:r>
+          </w:p>
+          <w:p>
+            <w:r>
+              <w:t>Total, one-way, and two-way by age, race, and sex (stages 3 and 4)</w:t>
+            </w:r>
+          </w:p>
+        </w:tc>
+        <w:tc>
+          <w:tcPr>
+            <w:tcW w:w="2772" w:type="dxa"/>
+          </w:tcPr>
+          <w:p>
+            <w:r>
+              <w:t>CDC (cdc.aggregated.county?), CDC STI Surveillance Reports, local health department data</w:t>
+            </w:r>
+          </w:p>
+        </w:tc>
+      </w:tr>
+      <w:tr>
+        <w:tc>
+          <w:tcPr>
+            <w:tcW w:w="2768" w:type="dxa"/>
+          </w:tcPr>
+          <w:p>
+            <w:r>
+              <w:t>Proportion of male primary &amp; secondary syphilis diagnoses that are among MSM</w:t>
+            </w:r>
+          </w:p>
+        </w:tc>
+        <w:tc>
+          <w:tcPr>
+            <w:tcW w:w="2409" w:type="dxa"/>
+          </w:tcPr>
+          <w:p>
+            <w:r>
+              <w:t>2016 to 2023 for most cities, with additional earlier years of data for Atlanta and New York City</w:t>
+            </w:r>
+          </w:p>
+        </w:tc>
+        <w:tc>
+          <w:tcPr>
+            <w:tcW w:w="2841" w:type="dxa"/>
+          </w:tcPr>
+          <w:p>
+            <w:r>
+              <w:t>Stages 2, 3, and 4</w:t>
+            </w:r>
+          </w:p>
+        </w:tc>
+        <w:tc>
+          <w:tcPr>
+            <w:tcW w:w="2772" w:type="dxa"/>
+          </w:tcPr>
+          <w:p>
+            <w:r>
+              <w:t>CDC surveillance reports (all cities) and the Morbidity and Mortality Weekly Report (Atlanta and New York City)</w:t>
+            </w:r>
+          </w:p>
+        </w:tc>
+      </w:tr>
+      <w:tr>
+        <w:tc>
+          <w:tcPr>
+            <w:tcW w:w="2768" w:type="dxa"/>
+          </w:tcPr>
+          <w:p>
+            <w:r>
+              <w:t>Early Latent syphilis diagnosis count</w:t>
+            </w:r>
+          </w:p>
+        </w:tc>
+        <w:tc>
+          <w:tcPr>
+            <w:tcW w:w="2409" w:type="dxa"/>
+          </w:tcPr>
+          <w:p>
+            <w:r>
+              <w:t>1993 to 2021 (total)</w:t>
+            </w:r>
+          </w:p>
+          <w:p>
+            <w:r>
+              <w:t>2019 to 2021 (one-way and two-way)</w:t>
+            </w:r>
+          </w:p>
+        </w:tc>
+        <w:tc>
+          <w:tcPr>
+            <w:tcW w:w="2841" w:type="dxa"/>
+          </w:tcPr>
+          <w:p>
+            <w:r>
+              <w:t>Total and one-way (stage 2) by age, race, and sex</w:t>
+            </w:r>
+          </w:p>
+          <w:p>
+            <w:r>
+              <w:t>Total, one-way, and two-way by age, race, and sex (stages 3 and 4)</w:t>
+            </w:r>
+          </w:p>
+        </w:tc>
+        <w:tc>
+          <w:tcPr>
+            <w:tcW w:w="2772" w:type="dxa"/>
           </w:tcPr>
           <w:p/>
         </w:tc>
-        <w:tc>
-          <w:tcPr>
-            <w:tcW w:w="2446" w:type="dxa"/>
+      </w:tr>
+      <w:tr>
+        <w:tc>
+          <w:tcPr>
+            <w:tcW w:w="2768" w:type="dxa"/>
+          </w:tcPr>
+          <w:p>
+            <w:r>
+              <w:t>Late/Unknown Duration syphilis diagnosis count</w:t>
+            </w:r>
+          </w:p>
+        </w:tc>
+        <w:tc>
+          <w:tcPr>
+            <w:tcW w:w="2409" w:type="dxa"/>
+          </w:tcPr>
+          <w:p>
+            <w:r>
+              <w:t>1993 to 2021 (total)</w:t>
+            </w:r>
+          </w:p>
+          <w:p>
+            <w:r>
+              <w:t>2019 to 2021 (one-way and two-way)</w:t>
+            </w:r>
+          </w:p>
+        </w:tc>
+        <w:tc>
+          <w:tcPr>
+            <w:tcW w:w="2841" w:type="dxa"/>
+          </w:tcPr>
+          <w:p>
+            <w:r>
+              <w:t>Total and one-way (stage 2) by age, race, and sex</w:t>
+            </w:r>
+          </w:p>
+          <w:p>
+            <w:r>
+              <w:t>Total, one-way, and two-way by age, race, and sex (stages 3 and 4)</w:t>
+            </w:r>
+          </w:p>
+        </w:tc>
+        <w:tc>
+          <w:tcPr>
+            <w:tcW w:w="2772" w:type="dxa"/>
           </w:tcPr>
           <w:p/>
         </w:tc>
-        <w:tc>
-          <w:tcPr>
-            <w:tcW w:w="2861" w:type="dxa"/>
-          </w:tcPr>
-          <w:p/>
-        </w:tc>
-        <w:tc>
-          <w:tcPr>
-            <w:tcW w:w="2682" w:type="dxa"/>
+      </w:tr>
+      <w:tr>
+        <w:tc>
+          <w:tcPr>
+            <w:tcW w:w="2768" w:type="dxa"/>
+          </w:tcPr>
+          <w:p>
+            <w:r>
+              <w:t>Proportion of adults tested for HIV each year?</w:t>
+            </w:r>
+          </w:p>
+        </w:tc>
+        <w:tc>
+          <w:tcPr>
+            <w:tcW w:w="2409" w:type="dxa"/>
+          </w:tcPr>
+          <w:p>
+            <w:r>
+              <w:t>2013 to 2024</w:t>
+            </w:r>
+          </w:p>
+        </w:tc>
+        <w:tc>
+          <w:tcPr>
+            <w:tcW w:w="2841" w:type="dxa"/>
+          </w:tcPr>
+          <w:p>
+            <w:r>
+              <w:t>Total and one-way by age, race, and sex (stages 2, 3, and 4)</w:t>
+            </w:r>
+          </w:p>
+        </w:tc>
+        <w:tc>
+          <w:tcPr>
+            <w:tcW w:w="2772" w:type="dxa"/>
+          </w:tcPr>
+          <w:p>
+            <w:r>
+              <w:t>BRFSS</w:t>
+            </w:r>
+          </w:p>
+        </w:tc>
+      </w:tr>
+      <w:tr>
+        <w:tc>
+          <w:tcPr>
+            <w:tcW w:w="2768" w:type="dxa"/>
+          </w:tcPr>
+          <w:p>
+            <w:r>
+              <w:t>Future growth in Primary &amp; Secondary syphilis count</w:t>
+            </w:r>
+          </w:p>
+        </w:tc>
+        <w:tc>
+          <w:tcPr>
+            <w:tcW w:w="2409" w:type="dxa"/>
+          </w:tcPr>
+          <w:p>
+            <w:r>
+              <w:t>2020 to 2030</w:t>
+            </w:r>
+          </w:p>
+        </w:tc>
+        <w:tc>
+          <w:tcPr>
+            <w:tcW w:w="2841" w:type="dxa"/>
+          </w:tcPr>
+          <w:p>
+            <w:r>
+              <w:t>Total (stages 2, 3, and 4)</w:t>
+            </w:r>
+          </w:p>
+        </w:tc>
+        <w:tc>
+          <w:tcPr>
+            <w:tcW w:w="2772" w:type="dxa"/>
           </w:tcPr>
           <w:p/>
         </w:tc>
@@ -4432,7 +4811,75 @@
         <w:spacing w:before="0" w:after="0"/>
       </w:pPr>
       <w:r>
-        <w:br w:type="page"/>
+        <w:rPr>
+          <w:i/>
+          <w:iCs/>
+        </w:rPr>
+        <w:t>Proportion of adults tested for HIV</w:t>
+      </w:r>
+      <w:r>
+        <w:t>: Since there is not consistently available data on the proportion of adults tested for STIs, the model calibrates instead to the proportion of adults tested for HIV, which is published at state- and city-levels through the Behavioral Risk Factor Surveillance System (BRFSS). The modeled STI screening rates are converted to corresponding HIV screening rates through multiplication by a set of calibrated parameters; the HIV screening rates are then compared to BRFSS data in the likelihood.</w:t>
+      </w:r>
+    </w:p>
+    <w:p>
+      <w:pPr>
+        <w:spacing w:before="0" w:after="0"/>
+      </w:pPr>
+    </w:p>
+    <w:p>
+      <w:pPr>
+        <w:spacing w:before="0" w:after="0"/>
+      </w:pPr>
+      <w:r>
+        <w:rPr>
+          <w:i/>
+          <w:iCs/>
+        </w:rPr>
+        <w:t>Future growth in primary &amp; secondary syphilis count</w:t>
+      </w:r>
+      <w:r>
+        <w:t>: This likelihood is included to penalize simulations that project a 10-year growth in primary &amp; secondary syphilis diagnoses that far exceeds the fastest growth seen in any US location in the past thirty years. This threshold was set at a ten-fold increase in diagnoses between 2020 and 2030, and simulations were only penalized if they grew by more between those two years. The growth in total primary &amp; secondary diagnoses, as well as growth in diagnoses stratified one-way by age, race, and sex, were included.</w:t>
+      </w:r>
+    </w:p>
+    <w:p>
+      <w:pPr>
+        <w:spacing w:before="0" w:after="0"/>
+      </w:pPr>
+    </w:p>
+    <w:p>
+      <w:pPr>
+        <w:spacing w:before="0" w:after="0"/>
+      </w:pPr>
+      <w:r>
+        <w:rPr>
+          <w:i/>
+          <w:iCs/>
+        </w:rPr>
+        <w:lastRenderedPageBreak/>
+        <w:t>Proportion of male primary &amp; secondary syphilis diagnoses that are among MSM</w:t>
+      </w:r>
+      <w:r>
+        <w:t>: Since most syphilis diagnosis data does not stratify male into separate heterosexual and MSM values, the model can meet diagnosis targets by projecting the correct number of total male diagnoses without properly distributing them between heterosexual men and MSM. However, some state-level data do disaggregate male into these two groups, so we calibrate projected proportion of male primary &amp; secondary syphilis diagnoses that are among MSM to the available state-level proportions.</w:t>
+      </w:r>
+    </w:p>
+    <w:p>
+      <w:pPr>
+        <w:spacing w:before="0" w:after="0"/>
+      </w:pPr>
+    </w:p>
+    <w:p>
+      <w:pPr>
+        <w:spacing w:before="0" w:after="0"/>
+      </w:pPr>
+      <w:r>
+        <w:rPr>
+          <w:i/>
+          <w:iCs/>
+        </w:rPr>
+        <w:t>Historical total syphilis diagnosis count:</w:t>
+      </w:r>
+      <w:r>
+        <w:t xml:space="preserve"> The model begins in 1970, but local-level data is often not available until after 1990. To avoid simulations projecting overly large or small numbers of cases in these early years, we calibrate each city’s projected total diagnoses in each year between 1970 to 1990 by constraining them to fall within a certain fraction of that city’s projected total diagnoses in 1990. 1990 was a peak of the syphilis epidemic in the United States, and national-level data is available that shows us the ratio of the number of cases in each preceding year versus that 1990 peak. Simulations for which projected values in the preceding years is too large or too small relative to that simulation’s 1990 projected value, using a window of acceptable ratios based on the national-level data, are penalized.</w:t>
       </w:r>
     </w:p>
     <w:p>
@@ -4440,7 +4887,6 @@
         <w:pStyle w:val="Heading2"/>
       </w:pPr>
       <w:r>
-        <w:lastRenderedPageBreak/>
         <w:t xml:space="preserve">Data sources </w:t>
       </w:r>
     </w:p>
@@ -11892,7 +12338,7 @@
 </file>
 
 <file path=word/comments.xml><?xml version="1.0" encoding="utf-8"?>
-<w:comments xmlns:wpc="http://schemas.microsoft.com/office/word/2010/wordprocessingCanvas" xmlns:cx="http://schemas.microsoft.com/office/drawing/2014/chartex" xmlns:cx1="http://schemas.microsoft.com/office/drawing/2015/9/8/chartex" xmlns:cx2="http://schemas.microsoft.com/office/drawing/2015/10/21/chartex" xmlns:cx3="http://schemas.microsoft.com/office/drawing/2016/5/9/chartex" xmlns:cx4="http://schemas.microsoft.com/office/drawing/2016/5/10/chartex" xmlns:cx5="http://schemas.microsoft.com/office/drawing/2016/5/11/chartex" xmlns:cx6="http://schemas.microsoft.com/office/drawing/2016/5/12/chartex" xmlns:cx7="http://schemas.microsoft.com/office/drawing/2016/5/13/chartex" xmlns:cx8="http://schemas.microsoft.com/office/drawing/2016/5/14/chartex" xmlns:mc="http://schemas.openxmlformats.org/markup-compatibility/2006" xmlns:m="http://schemas.openxmlformats.org/officeDocument/2006/math" xmlns:aink="http://schemas.microsoft.com/office/drawing/2016/ink" xmlns:am3d="http://schemas.microsoft.com/office/drawing/2017/model3d" xmlns:oel="http://schemas.microsoft.com/office/2019/extlst" xmlns:r="http://schemas.openxmlformats.org/officeDocument/2006/relationships" xmlns:wp14="http://schemas.microsoft.com/office/word/2010/wordprocessingDrawing" xmlns:wp="http://schemas.openxmlformats.org/drawingml/2006/wordprocessingDrawing" xmlns:wpg="http://schemas.microsoft.com/office/word/2010/wordprocessingGroup" xmlns:wpi="http://schemas.microsoft.com/office/word/2010/wordprocessingInk" xmlns:wps="http://schemas.microsoft.com/office/word/2010/wordprocessingShape" xmlns:o="urn:schemas-microsoft-com:office:office" xmlns:v="urn:schemas-microsoft-com:vml" xmlns:w10="urn:schemas-microsoft-com:office:word" xmlns:w="http://schemas.openxmlformats.org/wordprocessingml/2006/main" xmlns:w14="http://schemas.microsoft.com/office/word/2010/wordml" xmlns:w15="http://schemas.microsoft.com/office/word/2012/wordml" xmlns:w16cei="http://schemas.microsoft.com/office/word/2026/wordml/cei" xmlns:w16cex="http://schemas.microsoft.com/office/word/2018/wordml/cex" xmlns:w16cid="http://schemas.microsoft.com/office/word/2016/wordml/cid" xmlns:w16="http://schemas.microsoft.com/office/word/2018/wordml" xmlns:w16sdtdh="http://schemas.microsoft.com/office/word/2020/wordml/sdtdatahash" xmlns:w16sdtfl="http://schemas.microsoft.com/office/word/2024/wordml/sdtformatlock" xmlns:w16se="http://schemas.microsoft.com/office/word/2015/wordml/symex" xmlns:w16du="http://schemas.microsoft.com/office/word/2023/wordml/word16du" xmlns:wne="http://schemas.microsoft.com/office/word/2006/wordml" mc:Ignorable="w14 w15 w16se w16cid w16 w16cex w16sdtdh w16sdtfl w16du wp14">
+<w:comments xmlns:wpc="http://schemas.microsoft.com/office/word/2010/wordprocessingCanvas" xmlns:cx="http://schemas.microsoft.com/office/drawing/2014/chartex" xmlns:cx1="http://schemas.microsoft.com/office/drawing/2015/9/8/chartex" xmlns:cx2="http://schemas.microsoft.com/office/drawing/2015/10/21/chartex" xmlns:cx3="http://schemas.microsoft.com/office/drawing/2016/5/9/chartex" xmlns:cx4="http://schemas.microsoft.com/office/drawing/2016/5/10/chartex" xmlns:cx5="http://schemas.microsoft.com/office/drawing/2016/5/11/chartex" xmlns:cx6="http://schemas.microsoft.com/office/drawing/2016/5/12/chartex" xmlns:cx7="http://schemas.microsoft.com/office/drawing/2016/5/13/chartex" xmlns:cx8="http://schemas.microsoft.com/office/drawing/2016/5/14/chartex" xmlns:mc="http://schemas.openxmlformats.org/markup-compatibility/2006" xmlns:aink="http://schemas.microsoft.com/office/drawing/2016/ink" xmlns:am3d="http://schemas.microsoft.com/office/drawing/2017/model3d" xmlns:o="urn:schemas-microsoft-com:office:office" xmlns:oel="http://schemas.microsoft.com/office/2019/extlst" xmlns:r="http://schemas.openxmlformats.org/officeDocument/2006/relationships" xmlns:m="http://schemas.openxmlformats.org/officeDocument/2006/math" xmlns:v="urn:schemas-microsoft-com:vml" xmlns:wp14="http://schemas.microsoft.com/office/word/2010/wordprocessingDrawing" xmlns:wp="http://schemas.openxmlformats.org/drawingml/2006/wordprocessingDrawing" xmlns:w10="urn:schemas-microsoft-com:office:word" xmlns:w="http://schemas.openxmlformats.org/wordprocessingml/2006/main" xmlns:w14="http://schemas.microsoft.com/office/word/2010/wordml" xmlns:w15="http://schemas.microsoft.com/office/word/2012/wordml" xmlns:w16cei="http://schemas.microsoft.com/office/word/2026/wordml/cei" xmlns:w16cex="http://schemas.microsoft.com/office/word/2018/wordml/cex" xmlns:w16cid="http://schemas.microsoft.com/office/word/2016/wordml/cid" xmlns:w16="http://schemas.microsoft.com/office/word/2018/wordml" xmlns:w16du="http://schemas.microsoft.com/office/word/2023/wordml/word16du" xmlns:w16sdtdh="http://schemas.microsoft.com/office/word/2020/wordml/sdtdatahash" xmlns:w16sdtfl="http://schemas.microsoft.com/office/word/2024/wordml/sdtformatlock" xmlns:w16se="http://schemas.microsoft.com/office/word/2015/wordml/symex" xmlns:wpg="http://schemas.microsoft.com/office/word/2010/wordprocessingGroup" xmlns:wpi="http://schemas.microsoft.com/office/word/2010/wordprocessingInk" xmlns:wne="http://schemas.microsoft.com/office/word/2006/wordml" xmlns:wps="http://schemas.microsoft.com/office/word/2010/wordprocessingShape" mc:Ignorable="w14 w15 w16se w16cid w16 w16cex w16sdtdh w16sdtfl w16du wp14">
   <w:comment w:id="0" w:author="Parastu Kasaie" w:date="2026-06-29T12:13:00Z" w:initials="PK">
     <w:p>
       <w:r>
@@ -11950,7 +12396,7 @@
 </file>
 
 <file path=word/commentsExtended.xml><?xml version="1.0" encoding="utf-8"?>
-<w15:commentsEx xmlns:wpc="http://schemas.microsoft.com/office/word/2010/wordprocessingCanvas" xmlns:cx="http://schemas.microsoft.com/office/drawing/2014/chartex" xmlns:cx1="http://schemas.microsoft.com/office/drawing/2015/9/8/chartex" xmlns:cx2="http://schemas.microsoft.com/office/drawing/2015/10/21/chartex" xmlns:cx3="http://schemas.microsoft.com/office/drawing/2016/5/9/chartex" xmlns:cx4="http://schemas.microsoft.com/office/drawing/2016/5/10/chartex" xmlns:cx5="http://schemas.microsoft.com/office/drawing/2016/5/11/chartex" xmlns:cx6="http://schemas.microsoft.com/office/drawing/2016/5/12/chartex" xmlns:cx7="http://schemas.microsoft.com/office/drawing/2016/5/13/chartex" xmlns:cx8="http://schemas.microsoft.com/office/drawing/2016/5/14/chartex" xmlns:mc="http://schemas.openxmlformats.org/markup-compatibility/2006" xmlns:m="http://schemas.openxmlformats.org/officeDocument/2006/math" xmlns:aink="http://schemas.microsoft.com/office/drawing/2016/ink" xmlns:am3d="http://schemas.microsoft.com/office/drawing/2017/model3d" xmlns:oel="http://schemas.microsoft.com/office/2019/extlst" xmlns:r="http://schemas.openxmlformats.org/officeDocument/2006/relationships" xmlns:wp14="http://schemas.microsoft.com/office/word/2010/wordprocessingDrawing" xmlns:wp="http://schemas.openxmlformats.org/drawingml/2006/wordprocessingDrawing" xmlns:wpg="http://schemas.microsoft.com/office/word/2010/wordprocessingGroup" xmlns:wpi="http://schemas.microsoft.com/office/word/2010/wordprocessingInk" xmlns:wps="http://schemas.microsoft.com/office/word/2010/wordprocessingShape" xmlns:o="urn:schemas-microsoft-com:office:office" xmlns:v="urn:schemas-microsoft-com:vml" xmlns:w10="urn:schemas-microsoft-com:office:word" xmlns:w="http://schemas.openxmlformats.org/wordprocessingml/2006/main" xmlns:w14="http://schemas.microsoft.com/office/word/2010/wordml" xmlns:w15="http://schemas.microsoft.com/office/word/2012/wordml" xmlns:w16cei="http://schemas.microsoft.com/office/word/2026/wordml/cei" xmlns:w16cex="http://schemas.microsoft.com/office/word/2018/wordml/cex" xmlns:w16cid="http://schemas.microsoft.com/office/word/2016/wordml/cid" xmlns:w16="http://schemas.microsoft.com/office/word/2018/wordml" xmlns:w16sdtdh="http://schemas.microsoft.com/office/word/2020/wordml/sdtdatahash" xmlns:w16sdtfl="http://schemas.microsoft.com/office/word/2024/wordml/sdtformatlock" xmlns:w16se="http://schemas.microsoft.com/office/word/2015/wordml/symex" xmlns:w16du="http://schemas.microsoft.com/office/word/2023/wordml/word16du" xmlns:wne="http://schemas.microsoft.com/office/word/2006/wordml" mc:Ignorable="w14 w15 w16se w16cid w16 w16cex w16sdtdh w16sdtfl w16du wp14">
+<w15:commentsEx xmlns:wpc="http://schemas.microsoft.com/office/word/2010/wordprocessingCanvas" xmlns:cx="http://schemas.microsoft.com/office/drawing/2014/chartex" xmlns:cx1="http://schemas.microsoft.com/office/drawing/2015/9/8/chartex" xmlns:cx2="http://schemas.microsoft.com/office/drawing/2015/10/21/chartex" xmlns:cx3="http://schemas.microsoft.com/office/drawing/2016/5/9/chartex" xmlns:cx4="http://schemas.microsoft.com/office/drawing/2016/5/10/chartex" xmlns:cx5="http://schemas.microsoft.com/office/drawing/2016/5/11/chartex" xmlns:cx6="http://schemas.microsoft.com/office/drawing/2016/5/12/chartex" xmlns:cx7="http://schemas.microsoft.com/office/drawing/2016/5/13/chartex" xmlns:cx8="http://schemas.microsoft.com/office/drawing/2016/5/14/chartex" xmlns:mc="http://schemas.openxmlformats.org/markup-compatibility/2006" xmlns:aink="http://schemas.microsoft.com/office/drawing/2016/ink" xmlns:am3d="http://schemas.microsoft.com/office/drawing/2017/model3d" xmlns:o="urn:schemas-microsoft-com:office:office" xmlns:oel="http://schemas.microsoft.com/office/2019/extlst" xmlns:r="http://schemas.openxmlformats.org/officeDocument/2006/relationships" xmlns:m="http://schemas.openxmlformats.org/officeDocument/2006/math" xmlns:v="urn:schemas-microsoft-com:vml" xmlns:wp14="http://schemas.microsoft.com/office/word/2010/wordprocessingDrawing" xmlns:wp="http://schemas.openxmlformats.org/drawingml/2006/wordprocessingDrawing" xmlns:w10="urn:schemas-microsoft-com:office:word" xmlns:w="http://schemas.openxmlformats.org/wordprocessingml/2006/main" xmlns:w14="http://schemas.microsoft.com/office/word/2010/wordml" xmlns:w15="http://schemas.microsoft.com/office/word/2012/wordml" xmlns:w16cei="http://schemas.microsoft.com/office/word/2026/wordml/cei" xmlns:w16cex="http://schemas.microsoft.com/office/word/2018/wordml/cex" xmlns:w16cid="http://schemas.microsoft.com/office/word/2016/wordml/cid" xmlns:w16="http://schemas.microsoft.com/office/word/2018/wordml" xmlns:w16du="http://schemas.microsoft.com/office/word/2023/wordml/word16du" xmlns:w16sdtdh="http://schemas.microsoft.com/office/word/2020/wordml/sdtdatahash" xmlns:w16sdtfl="http://schemas.microsoft.com/office/word/2024/wordml/sdtformatlock" xmlns:w16se="http://schemas.microsoft.com/office/word/2015/wordml/symex" xmlns:wpg="http://schemas.microsoft.com/office/word/2010/wordprocessingGroup" xmlns:wpi="http://schemas.microsoft.com/office/word/2010/wordprocessingInk" xmlns:wne="http://schemas.microsoft.com/office/word/2006/wordml" xmlns:wps="http://schemas.microsoft.com/office/word/2010/wordprocessingShape" mc:Ignorable="w14 w15 w16se w16cid w16 w16cex w16sdtdh w16sdtfl w16du wp14">
   <w15:commentEx w15:paraId="3FD429F0" w15:done="0"/>
   <w15:commentEx w15:paraId="29833090" w15:done="0"/>
   <w15:commentEx w15:paraId="4FD6AB95" w15:done="0"/>
@@ -11958,7 +12404,7 @@
 </file>
 
 <file path=word/commentsExtensible.xml><?xml version="1.0" encoding="utf-8"?>
-<w16cex:commentsExtensible xmlns:wpc="http://schemas.microsoft.com/office/word/2010/wordprocessingCanvas" xmlns:cx="http://schemas.microsoft.com/office/drawing/2014/chartex" xmlns:cx1="http://schemas.microsoft.com/office/drawing/2015/9/8/chartex" xmlns:cx2="http://schemas.microsoft.com/office/drawing/2015/10/21/chartex" xmlns:cx3="http://schemas.microsoft.com/office/drawing/2016/5/9/chartex" xmlns:cx4="http://schemas.microsoft.com/office/drawing/2016/5/10/chartex" xmlns:cx5="http://schemas.microsoft.com/office/drawing/2016/5/11/chartex" xmlns:cx6="http://schemas.microsoft.com/office/drawing/2016/5/12/chartex" xmlns:cx7="http://schemas.microsoft.com/office/drawing/2016/5/13/chartex" xmlns:cx8="http://schemas.microsoft.com/office/drawing/2016/5/14/chartex" xmlns:cr="http://schemas.microsoft.com/office/comments/2020/reactions" xmlns:mc="http://schemas.openxmlformats.org/markup-compatibility/2006" xmlns:m="http://schemas.openxmlformats.org/officeDocument/2006/math" xmlns:aink="http://schemas.microsoft.com/office/drawing/2016/ink" xmlns:am3d="http://schemas.microsoft.com/office/drawing/2017/model3d" xmlns:oel="http://schemas.microsoft.com/office/2019/extlst" xmlns:r="http://schemas.openxmlformats.org/officeDocument/2006/relationships" xmlns:wp14="http://schemas.microsoft.com/office/word/2010/wordprocessingDrawing" xmlns:wp="http://schemas.openxmlformats.org/drawingml/2006/wordprocessingDrawing" xmlns:wpg="http://schemas.microsoft.com/office/word/2010/wordprocessingGroup" xmlns:wpi="http://schemas.microsoft.com/office/word/2010/wordprocessingInk" xmlns:wps="http://schemas.microsoft.com/office/word/2010/wordprocessingShape" xmlns:o="urn:schemas-microsoft-com:office:office" xmlns:v="urn:schemas-microsoft-com:vml" xmlns:w10="urn:schemas-microsoft-com:office:word" xmlns:w="http://schemas.openxmlformats.org/wordprocessingml/2006/main" xmlns:w14="http://schemas.microsoft.com/office/word/2010/wordml" xmlns:w15="http://schemas.microsoft.com/office/word/2012/wordml" xmlns:w16cei="http://schemas.microsoft.com/office/word/2026/wordml/cei" xmlns:w16cex="http://schemas.microsoft.com/office/word/2018/wordml/cex" xmlns:w16cid="http://schemas.microsoft.com/office/word/2016/wordml/cid" xmlns:w16="http://schemas.microsoft.com/office/word/2018/wordml" xmlns:w16sdtdh="http://schemas.microsoft.com/office/word/2020/wordml/sdtdatahash" xmlns:w16sdtfl="http://schemas.microsoft.com/office/word/2024/wordml/sdtformatlock" xmlns:w16se="http://schemas.microsoft.com/office/word/2015/wordml/symex" xmlns:w16du="http://schemas.microsoft.com/office/word/2023/wordml/word16du" xmlns:wne="http://schemas.microsoft.com/office/word/2006/wordml" mc:Ignorable="w14 w15 w16se w16cid w16 w16cex w16sdtdh w16sdtfl cr w16du wp14">
+<w16cex:commentsExtensible xmlns:wpc="http://schemas.microsoft.com/office/word/2010/wordprocessingCanvas" xmlns:cx="http://schemas.microsoft.com/office/drawing/2014/chartex" xmlns:cx1="http://schemas.microsoft.com/office/drawing/2015/9/8/chartex" xmlns:cx2="http://schemas.microsoft.com/office/drawing/2015/10/21/chartex" xmlns:cx3="http://schemas.microsoft.com/office/drawing/2016/5/9/chartex" xmlns:cx4="http://schemas.microsoft.com/office/drawing/2016/5/10/chartex" xmlns:cx5="http://schemas.microsoft.com/office/drawing/2016/5/11/chartex" xmlns:cx6="http://schemas.microsoft.com/office/drawing/2016/5/12/chartex" xmlns:cx7="http://schemas.microsoft.com/office/drawing/2016/5/13/chartex" xmlns:cx8="http://schemas.microsoft.com/office/drawing/2016/5/14/chartex" xmlns:cr="http://schemas.microsoft.com/office/comments/2020/reactions" xmlns:mc="http://schemas.openxmlformats.org/markup-compatibility/2006" xmlns:aink="http://schemas.microsoft.com/office/drawing/2016/ink" xmlns:am3d="http://schemas.microsoft.com/office/drawing/2017/model3d" xmlns:o="urn:schemas-microsoft-com:office:office" xmlns:oel="http://schemas.microsoft.com/office/2019/extlst" xmlns:r="http://schemas.openxmlformats.org/officeDocument/2006/relationships" xmlns:m="http://schemas.openxmlformats.org/officeDocument/2006/math" xmlns:v="urn:schemas-microsoft-com:vml" xmlns:wp14="http://schemas.microsoft.com/office/word/2010/wordprocessingDrawing" xmlns:wp="http://schemas.openxmlformats.org/drawingml/2006/wordprocessingDrawing" xmlns:w10="urn:schemas-microsoft-com:office:word" xmlns:w="http://schemas.openxmlformats.org/wordprocessingml/2006/main" xmlns:w14="http://schemas.microsoft.com/office/word/2010/wordml" xmlns:w15="http://schemas.microsoft.com/office/word/2012/wordml" xmlns:w16cei="http://schemas.microsoft.com/office/word/2026/wordml/cei" xmlns:w16cex="http://schemas.microsoft.com/office/word/2018/wordml/cex" xmlns:w16cid="http://schemas.microsoft.com/office/word/2016/wordml/cid" xmlns:w16="http://schemas.microsoft.com/office/word/2018/wordml" xmlns:w16du="http://schemas.microsoft.com/office/word/2023/wordml/word16du" xmlns:w16sdtdh="http://schemas.microsoft.com/office/word/2020/wordml/sdtdatahash" xmlns:w16sdtfl="http://schemas.microsoft.com/office/word/2024/wordml/sdtformatlock" xmlns:w16se="http://schemas.microsoft.com/office/word/2015/wordml/symex" xmlns:wpg="http://schemas.microsoft.com/office/word/2010/wordprocessingGroup" xmlns:wpi="http://schemas.microsoft.com/office/word/2010/wordprocessingInk" xmlns:wne="http://schemas.microsoft.com/office/word/2006/wordml" xmlns:wps="http://schemas.microsoft.com/office/word/2010/wordprocessingShape" mc:Ignorable="w14 w15 w16se w16cid w16 w16cex w16sdtdh w16sdtfl cr w16du wp14">
   <w16cex:commentExtensible w16cex:durableId="63E79D56" w16cex:dateUtc="2026-06-29T16:13:00Z"/>
   <w16cex:commentExtensible w16cex:durableId="1E3B593F" w16cex:dateUtc="2026-06-29T16:36:00Z"/>
   <w16cex:commentExtensible w16cex:durableId="742888CD" w16cex:dateUtc="2026-05-11T19:31:00Z"/>
@@ -11966,7 +12412,7 @@
 </file>
 
 <file path=word/commentsIds.xml><?xml version="1.0" encoding="utf-8"?>
-<w16cid:commentsIds xmlns:wpc="http://schemas.microsoft.com/office/word/2010/wordprocessingCanvas" xmlns:cx="http://schemas.microsoft.com/office/drawing/2014/chartex" xmlns:cx1="http://schemas.microsoft.com/office/drawing/2015/9/8/chartex" xmlns:cx2="http://schemas.microsoft.com/office/drawing/2015/10/21/chartex" xmlns:cx3="http://schemas.microsoft.com/office/drawing/2016/5/9/chartex" xmlns:cx4="http://schemas.microsoft.com/office/drawing/2016/5/10/chartex" xmlns:cx5="http://schemas.microsoft.com/office/drawing/2016/5/11/chartex" xmlns:cx6="http://schemas.microsoft.com/office/drawing/2016/5/12/chartex" xmlns:cx7="http://schemas.microsoft.com/office/drawing/2016/5/13/chartex" xmlns:cx8="http://schemas.microsoft.com/office/drawing/2016/5/14/chartex" xmlns:mc="http://schemas.openxmlformats.org/markup-compatibility/2006" xmlns:m="http://schemas.openxmlformats.org/officeDocument/2006/math" xmlns:aink="http://schemas.microsoft.com/office/drawing/2016/ink" xmlns:am3d="http://schemas.microsoft.com/office/drawing/2017/model3d" xmlns:oel="http://schemas.microsoft.com/office/2019/extlst" xmlns:r="http://schemas.openxmlformats.org/officeDocument/2006/relationships" xmlns:wp14="http://schemas.microsoft.com/office/word/2010/wordprocessingDrawing" xmlns:wp="http://schemas.openxmlformats.org/drawingml/2006/wordprocessingDrawing" xmlns:wpg="http://schemas.microsoft.com/office/word/2010/wordprocessingGroup" xmlns:wpi="http://schemas.microsoft.com/office/word/2010/wordprocessingInk" xmlns:wps="http://schemas.microsoft.com/office/word/2010/wordprocessingShape" xmlns:o="urn:schemas-microsoft-com:office:office" xmlns:v="urn:schemas-microsoft-com:vml" xmlns:w10="urn:schemas-microsoft-com:office:word" xmlns:w="http://schemas.openxmlformats.org/wordprocessingml/2006/main" xmlns:w14="http://schemas.microsoft.com/office/word/2010/wordml" xmlns:w15="http://schemas.microsoft.com/office/word/2012/wordml" xmlns:w16cei="http://schemas.microsoft.com/office/word/2026/wordml/cei" xmlns:w16cex="http://schemas.microsoft.com/office/word/2018/wordml/cex" xmlns:w16cid="http://schemas.microsoft.com/office/word/2016/wordml/cid" xmlns:w16="http://schemas.microsoft.com/office/word/2018/wordml" xmlns:w16sdtdh="http://schemas.microsoft.com/office/word/2020/wordml/sdtdatahash" xmlns:w16sdtfl="http://schemas.microsoft.com/office/word/2024/wordml/sdtformatlock" xmlns:w16se="http://schemas.microsoft.com/office/word/2015/wordml/symex" xmlns:w16du="http://schemas.microsoft.com/office/word/2023/wordml/word16du" xmlns:wne="http://schemas.microsoft.com/office/word/2006/wordml" mc:Ignorable="w14 w15 w16se w16cid w16 w16cex w16sdtdh w16sdtfl w16du wp14">
+<w16cid:commentsIds xmlns:wpc="http://schemas.microsoft.com/office/word/2010/wordprocessingCanvas" xmlns:cx="http://schemas.microsoft.com/office/drawing/2014/chartex" xmlns:cx1="http://schemas.microsoft.com/office/drawing/2015/9/8/chartex" xmlns:cx2="http://schemas.microsoft.com/office/drawing/2015/10/21/chartex" xmlns:cx3="http://schemas.microsoft.com/office/drawing/2016/5/9/chartex" xmlns:cx4="http://schemas.microsoft.com/office/drawing/2016/5/10/chartex" xmlns:cx5="http://schemas.microsoft.com/office/drawing/2016/5/11/chartex" xmlns:cx6="http://schemas.microsoft.com/office/drawing/2016/5/12/chartex" xmlns:cx7="http://schemas.microsoft.com/office/drawing/2016/5/13/chartex" xmlns:cx8="http://schemas.microsoft.com/office/drawing/2016/5/14/chartex" xmlns:mc="http://schemas.openxmlformats.org/markup-compatibility/2006" xmlns:aink="http://schemas.microsoft.com/office/drawing/2016/ink" xmlns:am3d="http://schemas.microsoft.com/office/drawing/2017/model3d" xmlns:o="urn:schemas-microsoft-com:office:office" xmlns:oel="http://schemas.microsoft.com/office/2019/extlst" xmlns:r="http://schemas.openxmlformats.org/officeDocument/2006/relationships" xmlns:m="http://schemas.openxmlformats.org/officeDocument/2006/math" xmlns:v="urn:schemas-microsoft-com:vml" xmlns:wp14="http://schemas.microsoft.com/office/word/2010/wordprocessingDrawing" xmlns:wp="http://schemas.openxmlformats.org/drawingml/2006/wordprocessingDrawing" xmlns:w10="urn:schemas-microsoft-com:office:word" xmlns:w="http://schemas.openxmlformats.org/wordprocessingml/2006/main" xmlns:w14="http://schemas.microsoft.com/office/word/2010/wordml" xmlns:w15="http://schemas.microsoft.com/office/word/2012/wordml" xmlns:w16cei="http://schemas.microsoft.com/office/word/2026/wordml/cei" xmlns:w16cex="http://schemas.microsoft.com/office/word/2018/wordml/cex" xmlns:w16cid="http://schemas.microsoft.com/office/word/2016/wordml/cid" xmlns:w16="http://schemas.microsoft.com/office/word/2018/wordml" xmlns:w16du="http://schemas.microsoft.com/office/word/2023/wordml/word16du" xmlns:w16sdtdh="http://schemas.microsoft.com/office/word/2020/wordml/sdtdatahash" xmlns:w16sdtfl="http://schemas.microsoft.com/office/word/2024/wordml/sdtformatlock" xmlns:w16se="http://schemas.microsoft.com/office/word/2015/wordml/symex" xmlns:wpg="http://schemas.microsoft.com/office/word/2010/wordprocessingGroup" xmlns:wpi="http://schemas.microsoft.com/office/word/2010/wordprocessingInk" xmlns:wne="http://schemas.microsoft.com/office/word/2006/wordml" xmlns:wps="http://schemas.microsoft.com/office/word/2010/wordprocessingShape" mc:Ignorable="w14 w15 w16se w16cid w16 w16cex w16sdtdh w16sdtfl w16du wp14">
   <w16cid:commentId w16cid:paraId="3FD429F0" w16cid:durableId="63E79D56"/>
   <w16cid:commentId w16cid:paraId="29833090" w16cid:durableId="1E3B593F"/>
   <w16cid:commentId w16cid:paraId="4FD6AB95" w16cid:durableId="742888CD"/>
@@ -11974,7 +12420,7 @@
 </file>
 
 <file path=word/numbering.xml><?xml version="1.0" encoding="utf-8"?>
-<w:numbering xmlns:wpc="http://schemas.microsoft.com/office/word/2010/wordprocessingCanvas" xmlns:cx="http://schemas.microsoft.com/office/drawing/2014/chartex" xmlns:cx1="http://schemas.microsoft.com/office/drawing/2015/9/8/chartex" xmlns:cx2="http://schemas.microsoft.com/office/drawing/2015/10/21/chartex" xmlns:cx3="http://schemas.microsoft.com/office/drawing/2016/5/9/chartex" xmlns:cx4="http://schemas.microsoft.com/office/drawing/2016/5/10/chartex" xmlns:cx5="http://schemas.microsoft.com/office/drawing/2016/5/11/chartex" xmlns:cx6="http://schemas.microsoft.com/office/drawing/2016/5/12/chartex" xmlns:cx7="http://schemas.microsoft.com/office/drawing/2016/5/13/chartex" xmlns:cx8="http://schemas.microsoft.com/office/drawing/2016/5/14/chartex" xmlns:mc="http://schemas.openxmlformats.org/markup-compatibility/2006" xmlns:m="http://schemas.openxmlformats.org/officeDocument/2006/math" xmlns:aink="http://schemas.microsoft.com/office/drawing/2016/ink" xmlns:am3d="http://schemas.microsoft.com/office/drawing/2017/model3d" xmlns:oel="http://schemas.microsoft.com/office/2019/extlst" xmlns:r="http://schemas.openxmlformats.org/officeDocument/2006/relationships" xmlns:wp14="http://schemas.microsoft.com/office/word/2010/wordprocessingDrawing" xmlns:wp="http://schemas.openxmlformats.org/drawingml/2006/wordprocessingDrawing" xmlns:wpg="http://schemas.microsoft.com/office/word/2010/wordprocessingGroup" xmlns:wpi="http://schemas.microsoft.com/office/word/2010/wordprocessingInk" xmlns:wps="http://schemas.microsoft.com/office/word/2010/wordprocessingShape" xmlns:o="urn:schemas-microsoft-com:office:office" xmlns:v="urn:schemas-microsoft-com:vml" xmlns:w10="urn:schemas-microsoft-com:office:word" xmlns:w="http://schemas.openxmlformats.org/wordprocessingml/2006/main" xmlns:w14="http://schemas.microsoft.com/office/word/2010/wordml" xmlns:w15="http://schemas.microsoft.com/office/word/2012/wordml" xmlns:w16cei="http://schemas.microsoft.com/office/word/2026/wordml/cei" xmlns:w16cex="http://schemas.microsoft.com/office/word/2018/wordml/cex" xmlns:w16cid="http://schemas.microsoft.com/office/word/2016/wordml/cid" xmlns:w16="http://schemas.microsoft.com/office/word/2018/wordml" xmlns:w16sdtdh="http://schemas.microsoft.com/office/word/2020/wordml/sdtdatahash" xmlns:w16sdtfl="http://schemas.microsoft.com/office/word/2024/wordml/sdtformatlock" xmlns:w16se="http://schemas.microsoft.com/office/word/2015/wordml/symex" xmlns:w16du="http://schemas.microsoft.com/office/word/2023/wordml/word16du" xmlns:wne="http://schemas.microsoft.com/office/word/2006/wordml" mc:Ignorable="w14 w15 w16se w16cid w16 w16cex w16sdtdh w16sdtfl w16du wp14">
+<w:numbering xmlns:wpc="http://schemas.microsoft.com/office/word/2010/wordprocessingCanvas" xmlns:cx="http://schemas.microsoft.com/office/drawing/2014/chartex" xmlns:cx1="http://schemas.microsoft.com/office/drawing/2015/9/8/chartex" xmlns:cx2="http://schemas.microsoft.com/office/drawing/2015/10/21/chartex" xmlns:cx3="http://schemas.microsoft.com/office/drawing/2016/5/9/chartex" xmlns:cx4="http://schemas.microsoft.com/office/drawing/2016/5/10/chartex" xmlns:cx5="http://schemas.microsoft.com/office/drawing/2016/5/11/chartex" xmlns:cx6="http://schemas.microsoft.com/office/drawing/2016/5/12/chartex" xmlns:cx7="http://schemas.microsoft.com/office/drawing/2016/5/13/chartex" xmlns:cx8="http://schemas.microsoft.com/office/drawing/2016/5/14/chartex" xmlns:mc="http://schemas.openxmlformats.org/markup-compatibility/2006" xmlns:aink="http://schemas.microsoft.com/office/drawing/2016/ink" xmlns:am3d="http://schemas.microsoft.com/office/drawing/2017/model3d" xmlns:o="urn:schemas-microsoft-com:office:office" xmlns:oel="http://schemas.microsoft.com/office/2019/extlst" xmlns:r="http://schemas.openxmlformats.org/officeDocument/2006/relationships" xmlns:m="http://schemas.openxmlformats.org/officeDocument/2006/math" xmlns:v="urn:schemas-microsoft-com:vml" xmlns:wp14="http://schemas.microsoft.com/office/word/2010/wordprocessingDrawing" xmlns:wp="http://schemas.openxmlformats.org/drawingml/2006/wordprocessingDrawing" xmlns:w10="urn:schemas-microsoft-com:office:word" xmlns:w="http://schemas.openxmlformats.org/wordprocessingml/2006/main" xmlns:w14="http://schemas.microsoft.com/office/word/2010/wordml" xmlns:w15="http://schemas.microsoft.com/office/word/2012/wordml" xmlns:w16cei="http://schemas.microsoft.com/office/word/2026/wordml/cei" xmlns:w16cex="http://schemas.microsoft.com/office/word/2018/wordml/cex" xmlns:w16cid="http://schemas.microsoft.com/office/word/2016/wordml/cid" xmlns:w16="http://schemas.microsoft.com/office/word/2018/wordml" xmlns:w16du="http://schemas.microsoft.com/office/word/2023/wordml/word16du" xmlns:w16sdtdh="http://schemas.microsoft.com/office/word/2020/wordml/sdtdatahash" xmlns:w16sdtfl="http://schemas.microsoft.com/office/word/2024/wordml/sdtformatlock" xmlns:w16se="http://schemas.microsoft.com/office/word/2015/wordml/symex" xmlns:wpg="http://schemas.microsoft.com/office/word/2010/wordprocessingGroup" xmlns:wpi="http://schemas.microsoft.com/office/word/2010/wordprocessingInk" xmlns:wne="http://schemas.microsoft.com/office/word/2006/wordml" xmlns:wps="http://schemas.microsoft.com/office/word/2010/wordprocessingShape" mc:Ignorable="w14 w15 w16se w16cid w16 w16cex w16sdtdh w16sdtfl w16du wp14">
   <w:abstractNum w:abstractNumId="0" w15:restartNumberingAfterBreak="0">
     <w:nsid w:val="009511E6"/>
     <w:multiLevelType w:val="multilevel"/>
@@ -16219,7 +16665,7 @@
 </file>
 
 <file path=word/people.xml><?xml version="1.0" encoding="utf-8"?>
-<w15:people xmlns:wpc="http://schemas.microsoft.com/office/word/2010/wordprocessingCanvas" xmlns:cx="http://schemas.microsoft.com/office/drawing/2014/chartex" xmlns:cx1="http://schemas.microsoft.com/office/drawing/2015/9/8/chartex" xmlns:cx2="http://schemas.microsoft.com/office/drawing/2015/10/21/chartex" xmlns:cx3="http://schemas.microsoft.com/office/drawing/2016/5/9/chartex" xmlns:cx4="http://schemas.microsoft.com/office/drawing/2016/5/10/chartex" xmlns:cx5="http://schemas.microsoft.com/office/drawing/2016/5/11/chartex" xmlns:cx6="http://schemas.microsoft.com/office/drawing/2016/5/12/chartex" xmlns:cx7="http://schemas.microsoft.com/office/drawing/2016/5/13/chartex" xmlns:cx8="http://schemas.microsoft.com/office/drawing/2016/5/14/chartex" xmlns:mc="http://schemas.openxmlformats.org/markup-compatibility/2006" xmlns:m="http://schemas.openxmlformats.org/officeDocument/2006/math" xmlns:aink="http://schemas.microsoft.com/office/drawing/2016/ink" xmlns:am3d="http://schemas.microsoft.com/office/drawing/2017/model3d" xmlns:oel="http://schemas.microsoft.com/office/2019/extlst" xmlns:r="http://schemas.openxmlformats.org/officeDocument/2006/relationships" xmlns:wp14="http://schemas.microsoft.com/office/word/2010/wordprocessingDrawing" xmlns:wp="http://schemas.openxmlformats.org/drawingml/2006/wordprocessingDrawing" xmlns:wpg="http://schemas.microsoft.com/office/word/2010/wordprocessingGroup" xmlns:wpi="http://schemas.microsoft.com/office/word/2010/wordprocessingInk" xmlns:wps="http://schemas.microsoft.com/office/word/2010/wordprocessingShape" xmlns:o="urn:schemas-microsoft-com:office:office" xmlns:v="urn:schemas-microsoft-com:vml" xmlns:w10="urn:schemas-microsoft-com:office:word" xmlns:w="http://schemas.openxmlformats.org/wordprocessingml/2006/main" xmlns:w14="http://schemas.microsoft.com/office/word/2010/wordml" xmlns:w15="http://schemas.microsoft.com/office/word/2012/wordml" xmlns:w16cei="http://schemas.microsoft.com/office/word/2026/wordml/cei" xmlns:w16cex="http://schemas.microsoft.com/office/word/2018/wordml/cex" xmlns:w16cid="http://schemas.microsoft.com/office/word/2016/wordml/cid" xmlns:w16="http://schemas.microsoft.com/office/word/2018/wordml" xmlns:w16sdtdh="http://schemas.microsoft.com/office/word/2020/wordml/sdtdatahash" xmlns:w16sdtfl="http://schemas.microsoft.com/office/word/2024/wordml/sdtformatlock" xmlns:w16se="http://schemas.microsoft.com/office/word/2015/wordml/symex" xmlns:w16du="http://schemas.microsoft.com/office/word/2023/wordml/word16du" xmlns:wne="http://schemas.microsoft.com/office/word/2006/wordml" mc:Ignorable="w14 w15 w16se w16cid w16 w16cex w16sdtdh w16sdtfl w16du wp14">
+<w15:people xmlns:wpc="http://schemas.microsoft.com/office/word/2010/wordprocessingCanvas" xmlns:cx="http://schemas.microsoft.com/office/drawing/2014/chartex" xmlns:cx1="http://schemas.microsoft.com/office/drawing/2015/9/8/chartex" xmlns:cx2="http://schemas.microsoft.com/office/drawing/2015/10/21/chartex" xmlns:cx3="http://schemas.microsoft.com/office/drawing/2016/5/9/chartex" xmlns:cx4="http://schemas.microsoft.com/office/drawing/2016/5/10/chartex" xmlns:cx5="http://schemas.microsoft.com/office/drawing/2016/5/11/chartex" xmlns:cx6="http://schemas.microsoft.com/office/drawing/2016/5/12/chartex" xmlns:cx7="http://schemas.microsoft.com/office/drawing/2016/5/13/chartex" xmlns:cx8="http://schemas.microsoft.com/office/drawing/2016/5/14/chartex" xmlns:mc="http://schemas.openxmlformats.org/markup-compatibility/2006" xmlns:aink="http://schemas.microsoft.com/office/drawing/2016/ink" xmlns:am3d="http://schemas.microsoft.com/office/drawing/2017/model3d" xmlns:o="urn:schemas-microsoft-com:office:office" xmlns:oel="http://schemas.microsoft.com/office/2019/extlst" xmlns:r="http://schemas.openxmlformats.org/officeDocument/2006/relationships" xmlns:m="http://schemas.openxmlformats.org/officeDocument/2006/math" xmlns:v="urn:schemas-microsoft-com:vml" xmlns:wp14="http://schemas.microsoft.com/office/word/2010/wordprocessingDrawing" xmlns:wp="http://schemas.openxmlformats.org/drawingml/2006/wordprocessingDrawing" xmlns:w10="urn:schemas-microsoft-com:office:word" xmlns:w="http://schemas.openxmlformats.org/wordprocessingml/2006/main" xmlns:w14="http://schemas.microsoft.com/office/word/2010/wordml" xmlns:w15="http://schemas.microsoft.com/office/word/2012/wordml" xmlns:w16cei="http://schemas.microsoft.com/office/word/2026/wordml/cei" xmlns:w16cex="http://schemas.microsoft.com/office/word/2018/wordml/cex" xmlns:w16cid="http://schemas.microsoft.com/office/word/2016/wordml/cid" xmlns:w16="http://schemas.microsoft.com/office/word/2018/wordml" xmlns:w16du="http://schemas.microsoft.com/office/word/2023/wordml/word16du" xmlns:w16sdtdh="http://schemas.microsoft.com/office/word/2020/wordml/sdtdatahash" xmlns:w16sdtfl="http://schemas.microsoft.com/office/word/2024/wordml/sdtformatlock" xmlns:w16se="http://schemas.microsoft.com/office/word/2015/wordml/symex" xmlns:wpg="http://schemas.microsoft.com/office/word/2010/wordprocessingGroup" xmlns:wpi="http://schemas.microsoft.com/office/word/2010/wordprocessingInk" xmlns:wne="http://schemas.microsoft.com/office/word/2006/wordml" xmlns:wps="http://schemas.microsoft.com/office/word/2010/wordprocessingShape" mc:Ignorable="w14 w15 w16se w16cid w16 w16cex w16sdtdh w16sdtfl w16du wp14">
   <w15:person w15:author="Parastu Kasaie">
     <w15:presenceInfo w15:providerId="None" w15:userId="Parastu Kasaie"/>
   </w15:person>
@@ -16227,7 +16673,7 @@
 </file>
 
 <file path=word/styles.xml><?xml version="1.0" encoding="utf-8"?>
-<w:styles xmlns:mc="http://schemas.openxmlformats.org/markup-compatibility/2006" xmlns:r="http://schemas.openxmlformats.org/officeDocument/2006/relationships" xmlns:w="http://schemas.openxmlformats.org/wordprocessingml/2006/main" xmlns:w14="http://schemas.microsoft.com/office/word/2010/wordml" xmlns:w15="http://schemas.microsoft.com/office/word/2012/wordml" xmlns:w16cex="http://schemas.microsoft.com/office/word/2018/wordml/cex" xmlns:w16cid="http://schemas.microsoft.com/office/word/2016/wordml/cid" xmlns:w16="http://schemas.microsoft.com/office/word/2018/wordml" xmlns:w16sdtdh="http://schemas.microsoft.com/office/word/2020/wordml/sdtdatahash" xmlns:w16sdtfl="http://schemas.microsoft.com/office/word/2024/wordml/sdtformatlock" xmlns:w16se="http://schemas.microsoft.com/office/word/2015/wordml/symex" xmlns:w16du="http://schemas.microsoft.com/office/word/2023/wordml/word16du" mc:Ignorable="w14 w15 w16se w16cid w16 w16cex w16sdtdh w16sdtfl w16du">
+<w:styles xmlns:mc="http://schemas.openxmlformats.org/markup-compatibility/2006" xmlns:r="http://schemas.openxmlformats.org/officeDocument/2006/relationships" xmlns:w="http://schemas.openxmlformats.org/wordprocessingml/2006/main" xmlns:w14="http://schemas.microsoft.com/office/word/2010/wordml" xmlns:w15="http://schemas.microsoft.com/office/word/2012/wordml" xmlns:w16cex="http://schemas.microsoft.com/office/word/2018/wordml/cex" xmlns:w16cid="http://schemas.microsoft.com/office/word/2016/wordml/cid" xmlns:w16="http://schemas.microsoft.com/office/word/2018/wordml" xmlns:w16du="http://schemas.microsoft.com/office/word/2023/wordml/word16du" xmlns:w16sdtdh="http://schemas.microsoft.com/office/word/2020/wordml/sdtdatahash" xmlns:w16sdtfl="http://schemas.microsoft.com/office/word/2024/wordml/sdtformatlock" xmlns:w16se="http://schemas.microsoft.com/office/word/2015/wordml/symex" mc:Ignorable="w14 w15 w16se w16cid w16 w16cex w16sdtdh w16sdtfl w16du">
   <w:docDefaults>
     <w:rPrDefault>
       <w:rPr>
@@ -16863,6 +17309,7 @@
   <w:style w:type="character" w:default="1" w:styleId="DefaultParagraphFont">
     <w:name w:val="Default Paragraph Font"/>
     <w:uiPriority w:val="1"/>
+    <w:semiHidden/>
     <w:unhideWhenUsed/>
   </w:style>
   <w:style w:type="table" w:default="1" w:styleId="TableNormal">

</xml_diff>